<commit_message>
Step 01: Methods X.1.1 rewritten to house style (past tense, no discovery narrative, filenames in running text)
</commit_message>
<xml_diff>
--- a/01_inputs_acquisition/writeup/methods_X1_1.docx
+++ b/01_inputs_acquisition/writeup/methods_X1_1.docx
@@ -62,25 +62,25 @@
         <w:t xml:space="preserve"> </w:t>
       </w:r>
       <w:r>
-        <w:t xml:space="preserve">§2–§3: prose first, then a Pipeline of Operations</w:t>
-      </w:r>
-      <w:r>
-        <w:t xml:space="preserve"> </w:t>
-      </w:r>
-      <w:r>
-        <w:t xml:space="preserve">glossary, a flowchart figure, Harvard citations, first person singular, methods in past</w:t>
-      </w:r>
-      <w:r>
-        <w:t xml:space="preserve"> </w:t>
-      </w:r>
-      <w:r>
-        <w:t xml:space="preserve">tense, and audit numbers reported as construction validation rather than as findings.</w:t>
-      </w:r>
-      <w:r>
-        <w:t xml:space="preserve"> </w:t>
-      </w:r>
-      <w:r>
-        <w:t xml:space="preserve">Source files for every statement below are in</w:t>
+        <w:t xml:space="preserve">§2–§3. Software names and versions are given here</w:t>
+      </w:r>
+      <w:r>
+        <w:t xml:space="preserve"> </w:t>
+      </w:r>
+      <w:r>
+        <w:t xml:space="preserve">only where they identify a source file; per §2 they are consolidated in the Computational</w:t>
+      </w:r>
+      <w:r>
+        <w:t xml:space="preserve"> </w:t>
+      </w:r>
+      <w:r>
+        <w:t xml:space="preserve">Details section rather than repeated in each methods subsection. Source files for every</w:t>
+      </w:r>
+      <w:r>
+        <w:t xml:space="preserve"> </w:t>
+      </w:r>
+      <w:r>
+        <w:t xml:space="preserve">statement below are in</w:t>
       </w:r>
       <w:r>
         <w:t xml:space="preserve"> </w:t>
@@ -107,7 +107,13 @@
         <w:pStyle w:val="FirstParagraph"/>
       </w:pPr>
       <w:r>
-        <w:t xml:space="preserve">I built the enzyme system on the crystallographic trimer of</w:t>
+        <w:t xml:space="preserve">I retrieved the protein scaffold as PDB entry 2CHT, the crystal structure of the</w:t>
+      </w:r>
+      <w:r>
+        <w:t xml:space="preserve"> </w:t>
+      </w:r>
+      <w:r>
+        <w:t xml:space="preserve">monofunctional chorismate mutase from</w:t>
       </w:r>
       <w:r>
         <w:t xml:space="preserve"> </w:t>
@@ -123,51 +129,25 @@
         <w:t xml:space="preserve"> </w:t>
       </w:r>
       <w:r>
-        <w:t xml:space="preserve">chorismate</w:t>
-      </w:r>
-      <w:r>
-        <w:t xml:space="preserve"> </w:t>
-      </w:r>
-      <w:r>
-        <w:t xml:space="preserve">mutase, and this subsection records the acquisition of the three raw inputs from which</w:t>
-      </w:r>
-      <w:r>
-        <w:t xml:space="preserve"> </w:t>
-      </w:r>
-      <w:r>
-        <w:t xml:space="preserve">every later structure derives: the protein scaffold, the terminal-repair donor, and the</w:t>
-      </w:r>
-      <w:r>
-        <w:t xml:space="preserve"> </w:t>
-      </w:r>
-      <w:r>
-        <w:t xml:space="preserve">chorismate substrate geometry. No structural modification is performed at this stage. The</w:t>
-      </w:r>
-      <w:r>
-        <w:t xml:space="preserve"> </w:t>
-      </w:r>
-      <w:r>
-        <w:t xml:space="preserve">product of the stage is a set of identified files and a provenance record sufficient to</w:t>
-      </w:r>
-      <w:r>
-        <w:t xml:space="preserve"> </w:t>
-      </w:r>
-      <w:r>
-        <w:t xml:space="preserve">reproduce them.</w:t>
-      </w:r>
-    </w:p>
-    <w:p>
-      <w:pPr>
-        <w:pStyle w:val="BodyText"/>
-      </w:pPr>
-      <w:r>
-        <w:t xml:space="preserve">I retrieved the protein scaffold as PDB entry 2CHT, the crystal structure of the</w:t>
-      </w:r>
-      <w:r>
-        <w:t xml:space="preserve"> </w:t>
-      </w:r>
-      <w:r>
-        <w:t xml:space="preserve">monofunctional chorismate mutase from</w:t>
+        <w:t xml:space="preserve">in complex with a</w:t>
+      </w:r>
+      <w:r>
+        <w:t xml:space="preserve"> </w:t>
+      </w:r>
+      <w:r>
+        <w:t xml:space="preserve">transition-state analogue (Chook, Ke and Lipscomb, 1993). I retrieved PDB entry 1DBF, the</w:t>
+      </w:r>
+      <w:r>
+        <w:t xml:space="preserve"> </w:t>
+      </w:r>
+      <w:r>
+        <w:t xml:space="preserve">1.30 Å structure of the same catalytic homotrimer, as the donor for the terminal repair</w:t>
+      </w:r>
+      <w:r>
+        <w:t xml:space="preserve"> </w:t>
+      </w:r>
+      <w:r>
+        <w:t xml:space="preserve">described in X.1.2 (Ladner</w:t>
       </w:r>
       <w:r>
         <w:t xml:space="preserve"> </w:t>
@@ -177,68 +157,85 @@
           <w:iCs/>
           <w:i/>
         </w:rPr>
-        <w:t xml:space="preserve">B. subtilis</w:t>
-      </w:r>
-      <w:r>
-        <w:t xml:space="preserve"> </w:t>
-      </w:r>
-      <w:r>
-        <w:t xml:space="preserve">in complex with a transition-state</w:t>
-      </w:r>
-      <w:r>
-        <w:t xml:space="preserve"> </w:t>
-      </w:r>
-      <w:r>
-        <w:t xml:space="preserve">analogue (Chook, Ke and Lipscomb, 1993). The deposition resolves twelve chains, A to L,</w:t>
-      </w:r>
-      <w:r>
-        <w:t xml:space="preserve"> </w:t>
-      </w:r>
-      <w:r>
-        <w:t xml:space="preserve">carrying 13529 protein atoms and 1815 heteroatoms. The only non-water heteroatom species</w:t>
-      </w:r>
-      <w:r>
-        <w:t xml:space="preserve"> </w:t>
-      </w:r>
-      <w:r>
-        <w:t xml:space="preserve">present is the analogue itself, 204 atoms distributed one copy per chain across twelve</w:t>
-      </w:r>
-      <w:r>
-        <w:t xml:space="preserve"> </w:t>
-      </w:r>
-      <w:r>
-        <w:t xml:space="preserve">sites. I retrieved PDB entry 1DBF, the 1.30 Å structure of the same catalytic homotrimer,</w:t>
-      </w:r>
-      <w:r>
-        <w:t xml:space="preserve"> </w:t>
-      </w:r>
-      <w:r>
-        <w:t xml:space="preserve">as the donor for the terminal repair described in X.1.2 (Ladner</w:t>
-      </w:r>
-      <w:r>
-        <w:t xml:space="preserve"> </w:t>
-      </w:r>
-      <w:r>
-        <w:rPr>
-          <w:iCs/>
-          <w:i/>
-        </w:rPr>
         <w:t xml:space="preserve">et al.</w:t>
       </w:r>
       <w:r>
-        <w:t xml:space="preserve">, 2000); it</w:t>
-      </w:r>
-      <w:r>
-        <w:t xml:space="preserve"> </w:t>
-      </w:r>
-      <w:r>
-        <w:t xml:space="preserve">resolves three chains, A to C, with 3156 protein atoms. Both files were downloaded from</w:t>
-      </w:r>
-      <w:r>
-        <w:t xml:space="preserve"> </w:t>
-      </w:r>
-      <w:r>
-        <w:t xml:space="preserve">the RCSB on 2026-07-06.</w:t>
+        <w:t xml:space="preserve">, 2000). I took the chorismate substrate coordinates as</w:t>
+      </w:r>
+      <w:r>
+        <w:t xml:space="preserve"> </w:t>
+      </w:r>
+      <w:r>
+        <w:t xml:space="preserve">three geometries pre-aligned to crystallographic analogue sites, from the CP2K examples</w:t>
+      </w:r>
+      <w:r>
+        <w:t xml:space="preserve"> </w:t>
+      </w:r>
+      <w:r>
+        <w:t xml:space="preserve">repository at commit</w:t>
+      </w:r>
+      <w:r>
+        <w:t xml:space="preserve"> </w:t>
+      </w:r>
+      <w:r>
+        <w:rPr>
+          <w:rStyle w:val="VerbatimChar"/>
+        </w:rPr>
+        <w:t xml:space="preserve">d71583a411a0a7d8557e94a24b87a3ceb87ec34e</w:t>
+      </w:r>
+      <w:r>
+        <w:t xml:space="preserve">. Both retrievals were</w:t>
+      </w:r>
+      <w:r>
+        <w:t xml:space="preserve"> </w:t>
+      </w:r>
+      <w:r>
+        <w:t xml:space="preserve">performed by</w:t>
+      </w:r>
+      <w:r>
+        <w:t xml:space="preserve"> </w:t>
+      </w:r>
+      <w:r>
+        <w:rPr>
+          <w:rStyle w:val="VerbatimChar"/>
+        </w:rPr>
+        <w:t xml:space="preserve">step01_download_inputs.sh</w:t>
+      </w:r>
+      <w:r>
+        <w:t xml:space="preserve">, which recorded the retrieval timestamp and the</w:t>
+      </w:r>
+      <w:r>
+        <w:t xml:space="preserve"> </w:t>
+      </w:r>
+      <w:r>
+        <w:t xml:space="preserve">upstream commit in</w:t>
+      </w:r>
+      <w:r>
+        <w:t xml:space="preserve"> </w:t>
+      </w:r>
+      <w:r>
+        <w:rPr>
+          <w:rStyle w:val="VerbatimChar"/>
+        </w:rPr>
+        <w:t xml:space="preserve">step01_provenance.txt</w:t>
+      </w:r>
+      <w:r>
+        <w:t xml:space="preserve"> </w:t>
+      </w:r>
+      <w:r>
+        <w:t xml:space="preserve">and the role of each file in</w:t>
+      </w:r>
+      <w:r>
+        <w:t xml:space="preserve"> </w:t>
+      </w:r>
+      <w:r>
+        <w:rPr>
+          <w:rStyle w:val="VerbatimChar"/>
+        </w:rPr>
+        <w:t xml:space="preserve">step01_download_manifest.tsv</w:t>
+      </w:r>
+      <w:r>
+        <w:t xml:space="preserve">.</w:t>
       </w:r>
     </w:p>
     <w:p>
@@ -246,43 +243,60 @@
         <w:pStyle w:val="BodyText"/>
       </w:pPr>
       <w:r>
-        <w:t xml:space="preserve">I took the chorismate substrate coordinates as three geometries pre-aligned to</w:t>
-      </w:r>
-      <w:r>
-        <w:t xml:space="preserve"> </w:t>
-      </w:r>
-      <w:r>
-        <w:t xml:space="preserve">crystallographic analogue sites, from the CP2K examples repository at commit</w:t>
-      </w:r>
-      <w:r>
-        <w:t xml:space="preserve"> </w:t>
-      </w:r>
-      <w:r>
-        <w:rPr>
-          <w:rStyle w:val="VerbatimChar"/>
-        </w:rPr>
-        <w:t xml:space="preserve">d71583a411a0a7d8557e94a24b87a3ceb87ec34e</w:t>
-      </w:r>
-      <w:r>
-        <w:t xml:space="preserve">. Each carries 24 atoms in 24 bonds, of</w:t>
-      </w:r>
-      <w:r>
-        <w:t xml:space="preserve"> </w:t>
-      </w:r>
-      <w:r>
-        <w:t xml:space="preserve">elemental composition C₁₀H₈O₆ and net formal charge −2, which is the value subsequently</w:t>
-      </w:r>
-      <w:r>
-        <w:t xml:space="preserve"> </w:t>
-      </w:r>
-      <w:r>
-        <w:t xml:space="preserve">assigned to the quantum region. I registered each geometry to the analogue site it had</w:t>
-      </w:r>
-      <w:r>
-        <w:t xml:space="preserve"> </w:t>
-      </w:r>
-      <w:r>
-        <w:t xml:space="preserve">been aligned against by matching molecular centres, giving</w:t>
+        <w:t xml:space="preserve">2CHT resolved twelve chains, A to L, carrying 13529 protein atoms and 1815 heteroatoms.</w:t>
+      </w:r>
+      <w:r>
+        <w:t xml:space="preserve"> </w:t>
+      </w:r>
+      <w:r>
+        <w:t xml:space="preserve">The only non-water heteroatom species present was the analogue, at 204 atoms distributed</w:t>
+      </w:r>
+      <w:r>
+        <w:t xml:space="preserve"> </w:t>
+      </w:r>
+      <w:r>
+        <w:t xml:space="preserve">one copy per chain across twelve sites. 1DBF resolved three chains, A to C, carrying 3156</w:t>
+      </w:r>
+      <w:r>
+        <w:t xml:space="preserve"> </w:t>
+      </w:r>
+      <w:r>
+        <w:t xml:space="preserve">protein atoms. Each of the three substrate geometries carried 24 atoms in 24 bonds, of</w:t>
+      </w:r>
+      <w:r>
+        <w:t xml:space="preserve"> </w:t>
+      </w:r>
+      <w:r>
+        <w:t xml:space="preserve">elemental composition C₁₀H₈O₆ and net formal charge −2, which set the charge assigned to</w:t>
+      </w:r>
+      <w:r>
+        <w:t xml:space="preserve"> </w:t>
+      </w:r>
+      <w:r>
+        <w:t xml:space="preserve">the quantum region in X.3.</w:t>
+      </w:r>
+    </w:p>
+    <w:p>
+      <w:pPr>
+        <w:pStyle w:val="BodyText"/>
+      </w:pPr>
+      <w:r>
+        <w:rPr>
+          <w:rStyle w:val="VerbatimChar"/>
+        </w:rPr>
+        <w:t xml:space="preserve">step01b_ligand_tsa_registration.sh</w:t>
+      </w:r>
+      <w:r>
+        <w:t xml:space="preserve"> </w:t>
+      </w:r>
+      <w:r>
+        <w:t xml:space="preserve">registered each substrate geometry to the analogue</w:t>
+      </w:r>
+      <w:r>
+        <w:t xml:space="preserve"> </w:t>
+      </w:r>
+      <w:r>
+        <w:t xml:space="preserve">site against which it had been aligned, by nearest molecular centre, assigning</w:t>
       </w:r>
       <w:r>
         <w:t xml:space="preserve"> </w:t>
@@ -297,7 +311,7 @@
         <w:t xml:space="preserve"> </w:t>
       </w:r>
       <w:r>
-        <w:t xml:space="preserve">to site K210,</w:t>
+        <w:t xml:space="preserve">to site K210 at a centre offset of 0.161 Å,</w:t>
       </w:r>
       <w:r>
         <w:t xml:space="preserve"> </w:t>
@@ -312,7 +326,7 @@
         <w:t xml:space="preserve"> </w:t>
       </w:r>
       <w:r>
-        <w:t xml:space="preserve">to site J212 and</w:t>
+        <w:t xml:space="preserve">to site J212 at 0.160 Å, and</w:t>
       </w:r>
       <w:r>
         <w:t xml:space="preserve"> </w:t>
@@ -327,19 +341,13 @@
         <w:t xml:space="preserve"> </w:t>
       </w:r>
       <w:r>
-        <w:t xml:space="preserve">to site L211, at centre offsets of 0.161, 0.160</w:t>
-      </w:r>
-      <w:r>
-        <w:t xml:space="preserve"> </w:t>
-      </w:r>
-      <w:r>
-        <w:t xml:space="preserve">and 0.203 Å. The assignment is unambiguous: the nearest alternative site in each case lies</w:t>
-      </w:r>
-      <w:r>
-        <w:t xml:space="preserve"> </w:t>
-      </w:r>
-      <w:r>
-        <w:t xml:space="preserve">at 22.18–22.27 Å, between 109 and 139 times the accepted distance.</w:t>
+        <w:t xml:space="preserve">to site L211 at 0.203 Å. The nearest alternative site lay at 22.272, 22.207 and</w:t>
+      </w:r>
+      <w:r>
+        <w:t xml:space="preserve"> </w:t>
+      </w:r>
+      <w:r>
+        <w:t xml:space="preserve">22.184 Å respectively.</w:t>
       </w:r>
     </w:p>
     <w:p>
@@ -347,19 +355,25 @@
         <w:pStyle w:val="BodyText"/>
       </w:pPr>
       <w:r>
-        <w:t xml:space="preserve">I locked the identity of all five raw inputs by SHA-256 checksum. The checksums are the</w:t>
-      </w:r>
-      <w:r>
-        <w:t xml:space="preserve"> </w:t>
-      </w:r>
-      <w:r>
-        <w:t xml:space="preserve">primary identity anchor for this work, since deposited structures may be re-versioned and</w:t>
-      </w:r>
-      <w:r>
-        <w:t xml:space="preserve"> </w:t>
-      </w:r>
-      <w:r>
-        <w:t xml:space="preserve">a repository commit may be rewritten, whereas a content hash cannot be.</w:t>
+        <w:t xml:space="preserve">I locked the identity of all five raw inputs by SHA-256 checksum in</w:t>
+      </w:r>
+      <w:r>
+        <w:t xml:space="preserve"> </w:t>
+      </w:r>
+      <w:r>
+        <w:rPr>
+          <w:rStyle w:val="VerbatimChar"/>
+        </w:rPr>
+        <w:t xml:space="preserve">sha256_step01_inputs.txt</w:t>
+      </w:r>
+      <w:r>
+        <w:t xml:space="preserve">, since deposited structures may be re-versioned and repository</w:t>
+      </w:r>
+      <w:r>
+        <w:t xml:space="preserve"> </w:t>
+      </w:r>
+      <w:r>
+        <w:t xml:space="preserve">commits may be rewritten.</w:t>
       </w:r>
     </w:p>
     <w:p>
@@ -811,19 +825,13 @@
         <w:t xml:space="preserve"> </w:t>
       </w:r>
       <w:r>
-        <w:t xml:space="preserve">Registration of each chorismate reference geometry to its</w:t>
-      </w:r>
-      <w:r>
-        <w:t xml:space="preserve"> </w:t>
-      </w:r>
-      <w:r>
-        <w:t xml:space="preserve">crystallographic analogue site, with the distance to the nearest alternative site.</w:t>
-      </w:r>
-      <w:r>
-        <w:t xml:space="preserve"> </w:t>
-      </w:r>
-      <w:r>
-        <w:t xml:space="preserve">Source:</w:t>
+        <w:t xml:space="preserve">Registration of each substrate geometry to its crystallographic analogue</w:t>
+      </w:r>
+      <w:r>
+        <w:t xml:space="preserve"> </w:t>
+      </w:r>
+      <w:r>
+        <w:t xml:space="preserve">site, with the distance to the nearest alternative site. Source:</w:t>
       </w:r>
       <w:r>
         <w:t xml:space="preserve"> </w:t>
@@ -858,11 +866,10 @@
         <w:jc w:val="start"/>
       </w:tblPr>
       <w:tblGrid>
-        <w:gridCol w:w="1584"/>
-        <w:gridCol w:w="1584"/>
-        <w:gridCol w:w="1584"/>
-        <w:gridCol w:w="1584"/>
-        <w:gridCol w:w="1584"/>
+        <w:gridCol w:w="1980"/>
+        <w:gridCol w:w="1980"/>
+        <w:gridCol w:w="1980"/>
+        <w:gridCol w:w="1980"/>
       </w:tblGrid>
       <w:tr>
         <w:trPr>
@@ -916,18 +923,6 @@
             </w:r>
           </w:p>
         </w:tc>
-        <w:tc>
-          <w:tcPr/>
-          <w:p>
-            <w:pPr>
-              <w:pStyle w:val="Compact"/>
-              <w:jc w:val="left"/>
-            </w:pPr>
-            <w:r>
-              <w:t xml:space="preserve">Margin</w:t>
-            </w:r>
-          </w:p>
-        </w:tc>
       </w:tr>
       <w:tr>
         <w:tc>
@@ -981,18 +976,6 @@
             </w:r>
           </w:p>
         </w:tc>
-        <w:tc>
-          <w:tcPr/>
-          <w:p>
-            <w:pPr>
-              <w:pStyle w:val="Compact"/>
-              <w:jc w:val="left"/>
-            </w:pPr>
-            <w:r>
-              <w:t xml:space="preserve">138×</w:t>
-            </w:r>
-          </w:p>
-        </w:tc>
       </w:tr>
       <w:tr>
         <w:tc>
@@ -1046,18 +1029,6 @@
             </w:r>
           </w:p>
         </w:tc>
-        <w:tc>
-          <w:tcPr/>
-          <w:p>
-            <w:pPr>
-              <w:pStyle w:val="Compact"/>
-              <w:jc w:val="left"/>
-            </w:pPr>
-            <w:r>
-              <w:t xml:space="preserve">139×</w:t>
-            </w:r>
-          </w:p>
-        </w:tc>
       </w:tr>
       <w:tr>
         <w:tc>
@@ -1111,18 +1082,6 @@
             </w:r>
           </w:p>
         </w:tc>
-        <w:tc>
-          <w:tcPr/>
-          <w:p>
-            <w:pPr>
-              <w:pStyle w:val="Compact"/>
-              <w:jc w:val="left"/>
-            </w:pPr>
-            <w:r>
-              <w:t xml:space="preserve">109×</w:t>
-            </w:r>
-          </w:p>
-        </w:tc>
       </w:tr>
     </w:tbl>
     <w:p>
@@ -1130,13 +1089,7 @@
         <w:pStyle w:val="BodyText"/>
       </w:pPr>
       <w:r>
-        <w:t xml:space="preserve">The starting point adopted here matches that of the primary computational reference for</w:t>
-      </w:r>
-      <w:r>
-        <w:t xml:space="preserve"> </w:t>
-      </w:r>
-      <w:r>
-        <w:t xml:space="preserve">this system. Claeyssens</w:t>
+        <w:t xml:space="preserve">Claeyssens</w:t>
       </w:r>
       <w:r>
         <w:t xml:space="preserve"> </w:t>
@@ -1152,37 +1105,25 @@
         <w:t xml:space="preserve"> </w:t>
       </w:r>
       <w:r>
-        <w:t xml:space="preserve">(2011) likewise model the enzyme-catalysed reaction from</w:t>
-      </w:r>
-      <w:r>
-        <w:t xml:space="preserve"> </w:t>
-      </w:r>
-      <w:r>
-        <w:t xml:space="preserve">PDB entry 2CHT with the transition-state analogue bound, substituting chorismate for the</w:t>
-      </w:r>
-      <w:r>
-        <w:t xml:space="preserve"> </w:t>
-      </w:r>
-      <w:r>
-        <w:t xml:space="preserve">analogue. Two aspects of the present acquisition depart from that work and are recorded</w:t>
-      </w:r>
-      <w:r>
-        <w:t xml:space="preserve"> </w:t>
-      </w:r>
-      <w:r>
-        <w:t xml:space="preserve">here rather than left implicit. First, the terminal repair described in X.1.2 has no</w:t>
-      </w:r>
-      <w:r>
-        <w:t xml:space="preserve"> </w:t>
-      </w:r>
-      <w:r>
-        <w:t xml:space="preserve">counterpart in their reported procedure, and follows instead the treatment of</w:t>
-      </w:r>
-      <w:r>
-        <w:t xml:space="preserve"> </w:t>
-      </w:r>
-      <w:r>
-        <w:t xml:space="preserve">Agbaglo</w:t>
+        <w:t xml:space="preserve">(2011) modelled the enzyme-catalysed reaction from the same</w:t>
+      </w:r>
+      <w:r>
+        <w:t xml:space="preserve"> </w:t>
+      </w:r>
+      <w:r>
+        <w:t xml:space="preserve">deposition with the analogue bound, substituting chorismate for the analogue. The</w:t>
+      </w:r>
+      <w:r>
+        <w:t xml:space="preserve"> </w:t>
+      </w:r>
+      <w:r>
+        <w:t xml:space="preserve">procedure adopted here departs from theirs in two respects. The terminal repair described</w:t>
+      </w:r>
+      <w:r>
+        <w:t xml:space="preserve"> </w:t>
+      </w:r>
+      <w:r>
+        <w:t xml:space="preserve">in X.1.2 has no counterpart in their reported procedure, and follows Agbaglo</w:t>
       </w:r>
       <w:r>
         <w:t xml:space="preserve"> </w:t>
@@ -1198,19 +1139,13 @@
         <w:t xml:space="preserve"> </w:t>
       </w:r>
       <w:r>
-        <w:t xml:space="preserve">(2024), who repair the same deposition from the same donor structure.</w:t>
-      </w:r>
-      <w:r>
-        <w:t xml:space="preserve"> </w:t>
-      </w:r>
-      <w:r>
-        <w:t xml:space="preserve">Second, the substrate geometries used here are pre-aligned reference structures, whereas</w:t>
-      </w:r>
-      <w:r>
-        <w:t xml:space="preserve"> </w:t>
-      </w:r>
-      <w:r>
-        <w:t xml:space="preserve">Claeyssens</w:t>
+        <w:t xml:space="preserve">(2024), who repaired the same deposition from the same donor structure. The substrate</w:t>
+      </w:r>
+      <w:r>
+        <w:t xml:space="preserve"> </w:t>
+      </w:r>
+      <w:r>
+        <w:t xml:space="preserve">geometries used here were pre-aligned reference structures, whereas Claeyssens</w:t>
       </w:r>
       <w:r>
         <w:t xml:space="preserve"> </w:t>
@@ -1226,31 +1161,31 @@
         <w:t xml:space="preserve"> </w:t>
       </w:r>
       <w:r>
-        <w:t xml:space="preserve">describe their substitution by reference to earlier work</w:t>
-      </w:r>
-      <w:r>
-        <w:t xml:space="preserve"> </w:t>
-      </w:r>
-      <w:r>
-        <w:rPr>
-          <w:rStyle w:val="VerbatimChar"/>
-        </w:rPr>
-        <w:t xml:space="preserve">[PLACEHOLDER — needs sourcing: Claeyssens et al. (2011) cite their references 9 and 10 for the substitution procedure, being Ranaghan, Ridder, Szefczyk, Sokalski, Hermann and Mulholland, Mol. Phys. 2003, 101, 2695–2714 and Org. Biomol. Chem. 2004, 2, 968–980. Neither is held and no DOI is available for either, so the procedure departed from cannot presently be described. See Sourcing gaps.]</w:t>
-      </w:r>
-      <w:r>
-        <w:t xml:space="preserve">. The analogue is not isosteric with the</w:t>
-      </w:r>
-      <w:r>
-        <w:t xml:space="preserve"> </w:t>
-      </w:r>
-      <w:r>
-        <w:t xml:space="preserve">substrate, carrying seventeen heavy atoms against sixteen in the chorismate dianion, so</w:t>
-      </w:r>
-      <w:r>
-        <w:t xml:space="preserve"> </w:t>
-      </w:r>
-      <w:r>
-        <w:t xml:space="preserve">the superposition performed in X.1.4 is not an atom-for-atom correspondence under either</w:t>
+        <w:t xml:space="preserve">described their substitution by reference to earlier work</w:t>
+      </w:r>
+      <w:r>
+        <w:t xml:space="preserve"> </w:t>
+      </w:r>
+      <w:r>
+        <w:rPr>
+          <w:rStyle w:val="VerbatimChar"/>
+        </w:rPr>
+        <w:t xml:space="preserve">[PLACEHOLDER — needs sourcing: Claeyssens et al. (2011) cite their references 9 and 10 for the substitution procedure, being Ranaghan, Ridder, Szefczyk, Sokalski, Hermann and Mulholland, Mol. Phys. 2003, 101, 2695–2714 and Org. Biomol. Chem. 2004, 2, 968–980. Neither is held and no DOI is available for either. See Sourcing gaps.]</w:t>
+      </w:r>
+      <w:r>
+        <w:t xml:space="preserve">. The analogue</w:t>
+      </w:r>
+      <w:r>
+        <w:t xml:space="preserve"> </w:t>
+      </w:r>
+      <w:r>
+        <w:t xml:space="preserve">carried seventeen heavy atoms against sixteen in the chorismate dianion, so the</w:t>
+      </w:r>
+      <w:r>
+        <w:t xml:space="preserve"> </w:t>
+      </w:r>
+      <w:r>
+        <w:t xml:space="preserve">superposition performed in X.1.4 was not an atom-for-atom correspondence under either</w:t>
       </w:r>
       <w:r>
         <w:t xml:space="preserve"> </w:t>
@@ -1298,7 +1233,7 @@
         <w:t xml:space="preserve"> </w:t>
       </w:r>
       <w:r>
-        <w:t xml:space="preserve">commit, reports a structural inventory of both depositions, and writes the role manifest,</w:t>
+        <w:t xml:space="preserve">commit, reports a structural inventory of both depositions, and records role assignments,</w:t>
       </w:r>
       <w:r>
         <w:t xml:space="preserve"> </w:t>
@@ -1421,19 +1356,19 @@
         <w:t xml:space="preserve"> </w:t>
       </w:r>
       <w:r>
-        <w:t xml:space="preserve">— matches each chorismate reference geometry to the</w:t>
-      </w:r>
-      <w:r>
-        <w:t xml:space="preserve"> </w:t>
-      </w:r>
-      <w:r>
-        <w:t xml:space="preserve">crystallographic analogue site it was aligned against, by nearest molecular centre.</w:t>
-      </w:r>
-      <w:r>
-        <w:t xml:space="preserve"> </w:t>
-      </w:r>
-      <w:r>
-        <w:t xml:space="preserve">Outputs</w:t>
+        <w:t xml:space="preserve">— registers each chorismate reference geometry to</w:t>
+      </w:r>
+      <w:r>
+        <w:t xml:space="preserve"> </w:t>
+      </w:r>
+      <w:r>
+        <w:t xml:space="preserve">the crystallographic analogue site against which it was aligned, by nearest molecular</w:t>
+      </w:r>
+      <w:r>
+        <w:t xml:space="preserve"> </w:t>
+      </w:r>
+      <w:r>
+        <w:t xml:space="preserve">centre. Outputs</w:t>
       </w:r>
       <w:r>
         <w:t xml:space="preserve"> </w:t>
@@ -1466,25 +1401,25 @@
         <w:t xml:space="preserve"> </w:t>
       </w:r>
       <w:r>
-        <w:t xml:space="preserve">— re-runnable audit of the above: recomputes all five checksums,</w:t>
-      </w:r>
-      <w:r>
-        <w:t xml:space="preserve"> </w:t>
-      </w:r>
-      <w:r>
-        <w:t xml:space="preserve">reproduces the structural inventory and the analogue site list, confirms the elemental</w:t>
-      </w:r>
-      <w:r>
-        <w:t xml:space="preserve"> </w:t>
-      </w:r>
-      <w:r>
-        <w:t xml:space="preserve">composition and net charge of each ligand, and reports the registration margin against</w:t>
-      </w:r>
-      <w:r>
-        <w:t xml:space="preserve"> </w:t>
-      </w:r>
-      <w:r>
-        <w:t xml:space="preserve">the nearest alternative site. Outputs</w:t>
+        <w:t xml:space="preserve">— recomputes all five checksums, reproduces the structural inventory</w:t>
+      </w:r>
+      <w:r>
+        <w:t xml:space="preserve"> </w:t>
+      </w:r>
+      <w:r>
+        <w:t xml:space="preserve">and the analogue site list, confirms the elemental composition and net charge of each</w:t>
+      </w:r>
+      <w:r>
+        <w:t xml:space="preserve"> </w:t>
+      </w:r>
+      <w:r>
+        <w:t xml:space="preserve">substrate geometry, and measures each registration against the nearest alternative site.</w:t>
+      </w:r>
+      <w:r>
+        <w:t xml:space="preserve"> </w:t>
+      </w:r>
+      <w:r>
+        <w:t xml:space="preserve">Outputs</w:t>
       </w:r>
       <w:r>
         <w:t xml:space="preserve"> </w:t>
@@ -1605,13 +1540,7 @@
         <w:t xml:space="preserve"> </w:t>
       </w:r>
       <w:r>
-        <w:t xml:space="preserve">is available for either. Until supplied, the departure described above cannot be</w:t>
-      </w:r>
-      <w:r>
-        <w:t xml:space="preserve"> </w:t>
-      </w:r>
-      <w:r>
-        <w:t xml:space="preserve">characterised.</w:t>
+        <w:t xml:space="preserve">is available for either.</w:t>
       </w:r>
       <w:r>
         <w:t xml:space="preserve"> </w:t>
@@ -1657,7 +1586,13 @@
         <w:t xml:space="preserve">2</w:t>
       </w:r>
       <w:r>
-        <w:t xml:space="preserve">, 968–980.</w:t>
+        <w:t xml:space="preserve">,</w:t>
+      </w:r>
+      <w:r>
+        <w:t xml:space="preserve"> </w:t>
+      </w:r>
+      <w:r>
+        <w:t xml:space="preserve">968–980.</w:t>
       </w:r>
     </w:p>
     <w:p>
@@ -1885,37 +1820,25 @@
         <w:t xml:space="preserve"> </w:t>
       </w:r>
       <w:r>
-        <w:t xml:space="preserve">states that 24 atoms is consistent with the chorismate</w:t>
-      </w:r>
-      <w:r>
-        <w:t xml:space="preserve"> </w:t>
-      </w:r>
-      <w:r>
-        <w:t xml:space="preserve">dianion and directs that elemental composition and net charge be confirmed from the</w:t>
-      </w:r>
-      <w:r>
-        <w:t xml:space="preserve"> </w:t>
-      </w:r>
-      <w:r>
-        <w:t xml:space="preserve">mol2 before that charge is used to set the quantum-region charge. The code reports only</w:t>
-      </w:r>
-      <w:r>
-        <w:t xml:space="preserve"> </w:t>
-      </w:r>
-      <w:r>
-        <w:t xml:space="preserve">the molecule name, atom count and bond count. No committed output contained the</w:t>
-      </w:r>
-      <w:r>
-        <w:t xml:space="preserve"> </w:t>
-      </w:r>
-      <w:r>
-        <w:t xml:space="preserve">elemental or charge confirmation, so the quantum-region charge of −2 rested on an</w:t>
-      </w:r>
-      <w:r>
-        <w:t xml:space="preserve"> </w:t>
-      </w:r>
-      <w:r>
-        <w:t xml:space="preserve">unperformed check. The confirmation is now implemented in</w:t>
+        <w:t xml:space="preserve">directs that elemental composition and net charge be</w:t>
+      </w:r>
+      <w:r>
+        <w:t xml:space="preserve"> </w:t>
+      </w:r>
+      <w:r>
+        <w:t xml:space="preserve">confirmed from the mol2 before that charge is used to set the quantum-region charge. The</w:t>
+      </w:r>
+      <w:r>
+        <w:t xml:space="preserve"> </w:t>
+      </w:r>
+      <w:r>
+        <w:t xml:space="preserve">code reports only the molecule name, atom count and bond count. No committed output</w:t>
+      </w:r>
+      <w:r>
+        <w:t xml:space="preserve"> </w:t>
+      </w:r>
+      <w:r>
+        <w:t xml:space="preserve">contained the elemental or charge confirmation. The confirmation is implemented in</w:t>
       </w:r>
       <w:r>
         <w:t xml:space="preserve"> </w:t>
@@ -1930,13 +1853,7 @@
         <w:t xml:space="preserve"> </w:t>
       </w:r>
       <w:r>
-        <w:t xml:space="preserve">and</w:t>
-      </w:r>
-      <w:r>
-        <w:t xml:space="preserve"> </w:t>
-      </w:r>
-      <w:r>
-        <w:t xml:space="preserve">passes for all three geometries.</w:t>
+        <w:t xml:space="preserve">and passes for all three geometries.</w:t>
       </w:r>
     </w:p>
     <w:p>
@@ -1973,13 +1890,28 @@
         <w:t xml:space="preserve"> </w:t>
       </w:r>
       <w:r>
-        <w:t xml:space="preserve">next nearest. The assignment is in fact unambiguous by two orders of magnitude, but this</w:t>
-      </w:r>
-      <w:r>
-        <w:t xml:space="preserve"> </w:t>
-      </w:r>
-      <w:r>
-        <w:t xml:space="preserve">is established by the verification script rather than by the acquisition script.</w:t>
+        <w:t xml:space="preserve">next nearest. The margin is measured by</w:t>
+      </w:r>
+      <w:r>
+        <w:t xml:space="preserve"> </w:t>
+      </w:r>
+      <w:r>
+        <w:rPr>
+          <w:rStyle w:val="VerbatimChar"/>
+        </w:rPr>
+        <w:t xml:space="preserve">checks/step01_verify.py</w:t>
+      </w:r>
+      <w:r>
+        <w:t xml:space="preserve"> </w:t>
+      </w:r>
+      <w:r>
+        <w:t xml:space="preserve">rather than by the</w:t>
+      </w:r>
+      <w:r>
+        <w:t xml:space="preserve"> </w:t>
+      </w:r>
+      <w:r>
+        <w:t xml:space="preserve">acquisition script.</w:t>
       </w:r>
     </w:p>
     <w:p>
@@ -2059,13 +1991,13 @@
         <w:t xml:space="preserve"> </w:t>
       </w:r>
       <w:r>
-        <w:t xml:space="preserve">records a retrieval timestamp and the upstream repository commit, but no RCSB file</w:t>
-      </w:r>
-      <w:r>
-        <w:t xml:space="preserve"> </w:t>
-      </w:r>
-      <w:r>
-        <w:t xml:space="preserve">version. Identity is pinned by the recorded checksums rather than by the timestamp.</w:t>
+        <w:t xml:space="preserve">records a retrieval timestamp and the upstream repository</w:t>
+      </w:r>
+      <w:r>
+        <w:t xml:space="preserve"> </w:t>
+      </w:r>
+      <w:r>
+        <w:t xml:space="preserve">commit, but no RCSB file version. Identity is pinned by the recorded checksums.</w:t>
       </w:r>
     </w:p>
     <w:bookmarkEnd w:id="23"/>
@@ -2218,13 +2150,13 @@
         <w:pStyle w:val="Compact"/>
       </w:pPr>
       <w:r>
-        <w:t xml:space="preserve">Ligand composition confirmed for all three geometries: 24 atoms, 24 bonds, C₁₀H₈O₆, net</w:t>
-      </w:r>
-      <w:r>
-        <w:t xml:space="preserve"> </w:t>
-      </w:r>
-      <w:r>
-        <w:t xml:space="preserve">charge −2.0000.</w:t>
+        <w:t xml:space="preserve">Substrate geometry confirmed for all three files: 24 atoms, 24 bonds, C₁₀H₈O₆, net charge</w:t>
+      </w:r>
+      <w:r>
+        <w:t xml:space="preserve"> </w:t>
+      </w:r>
+      <w:r>
+        <w:t xml:space="preserve">−2.0000.</w:t>
       </w:r>
     </w:p>
     <w:p>
@@ -2236,13 +2168,7 @@
         <w:pStyle w:val="Compact"/>
       </w:pPr>
       <w:r>
-        <w:t xml:space="preserve">Registration margins measured: 22.11, 22.05 and 21.98 Å to the nearest alternative site,</w:t>
-      </w:r>
-      <w:r>
-        <w:t xml:space="preserve"> </w:t>
-      </w:r>
-      <w:r>
-        <w:t xml:space="preserve">corresponding to factors of 138, 139 and 109.</w:t>
+        <w:t xml:space="preserve">Registration margins measured: 22.11, 22.05 and 21.98 Å to the nearest alternative site.</w:t>
       </w:r>
     </w:p>
     <w:p>

</xml_diff>